<commit_message>
Added name to informed consent form, and removed gender / age group - better to collect this through post-session survey
</commit_message>
<xml_diff>
--- a/Work Group Guide/Source/Informed Consent Form.docx
+++ b/Work Group Guide/Source/Informed Consent Form.docx
@@ -1240,7 +1240,23 @@
                 <w:bCs/>
                 <w:lang w:val="en-US"/>
               </w:rPr>
-              <w:t>Your role in the organization:</w:t>
+              <w:t xml:space="preserve">Your </w:t>
+            </w:r>
+            <w:r>
+              <w:rPr>
+                <w:b/>
+                <w:bCs/>
+                <w:lang w:val="en-US"/>
+              </w:rPr>
+              <w:t>name</w:t>
+            </w:r>
+            <w:r>
+              <w:rPr>
+                <w:b/>
+                <w:bCs/>
+                <w:lang w:val="en-US"/>
+              </w:rPr>
+              <w:t>:</w:t>
             </w:r>
           </w:p>
         </w:tc>
@@ -1304,11 +1320,11 @@
           </w:tcPr>
           <w:p>
             <w:pPr>
+              <w:jc w:val="center"/>
               <w:rPr>
                 <w:color w:val="2E6DA4"/>
                 <w:sz w:val="26"/>
                 <w:szCs w:val="26"/>
-                <w:lang w:val="en-US"/>
               </w:rPr>
             </w:pPr>
           </w:p>
@@ -1344,26 +1360,7 @@
                 <w:bCs/>
                 <w:lang w:val="en-US"/>
               </w:rPr>
-              <w:t>E-mail address:</w:t>
-            </w:r>
-          </w:p>
-          <w:p>
-            <w:pPr>
-              <w:rPr>
-                <w:i/>
-                <w:iCs/>
-                <w:lang w:val="en-US"/>
-              </w:rPr>
-            </w:pPr>
-            <w:r>
-              <w:rPr>
-                <w:i/>
-                <w:iCs/>
-                <w:sz w:val="16"/>
-                <w:szCs w:val="16"/>
-                <w:lang w:val="en-US"/>
-              </w:rPr>
-              <w:t>We only use this for a short follow-up survey.</w:t>
+              <w:t>Your role in the organization:</w:t>
             </w:r>
           </w:p>
         </w:tc>
@@ -1467,7 +1464,23 @@
                 <w:bCs/>
                 <w:lang w:val="en-US"/>
               </w:rPr>
-              <w:t>Your age group:</w:t>
+              <w:t>E-mail address</w:t>
+            </w:r>
+            <w:r>
+              <w:rPr>
+                <w:b/>
+                <w:bCs/>
+                <w:lang w:val="en-US"/>
+              </w:rPr>
+              <w:t xml:space="preserve"> (optional)</w:t>
+            </w:r>
+            <w:r>
+              <w:rPr>
+                <w:b/>
+                <w:bCs/>
+                <w:lang w:val="en-US"/>
+              </w:rPr>
+              <w:t>:</w:t>
             </w:r>
           </w:p>
           <w:p>
@@ -1486,7 +1499,7 @@
                 <w:szCs w:val="16"/>
                 <w:lang w:val="en-US"/>
               </w:rPr>
-              <w:t>We ask this solely for demographic purposes.</w:t>
+              <w:t>We only use this for a short follow-up survey.</w:t>
             </w:r>
           </w:p>
         </w:tc>
@@ -1505,470 +1518,18 @@
           <w:p>
             <w:pPr>
               <w:rPr>
-                <w:lang w:val="en-US"/>
-              </w:rPr>
-            </w:pPr>
-            <w:r>
-              <w:rPr>
-                <w:b/>
-                <w:bCs/>
-                <w:lang w:val="en-US"/>
-              </w:rPr>
-              <w:br/>
-            </w:r>
-            <w:r>
-              <w:rPr>
-                <w:b/>
-                <w:bCs/>
-                <w:sz w:val="24"/>
-                <w:szCs w:val="28"/>
-                <w:lang w:val="en-US"/>
-              </w:rPr>
-              <w:sym w:font="Wingdings" w:char="F0A8"/>
-            </w:r>
-            <w:r>
-              <w:rPr>
-                <w:b/>
-                <w:bCs/>
-                <w:lang w:val="en-US"/>
-              </w:rPr>
-              <w:t xml:space="preserve"> </w:t>
-            </w:r>
-            <w:r>
-              <w:rPr>
-                <w:lang w:val="en-US"/>
-              </w:rPr>
-              <w:t xml:space="preserve">18-25 </w:t>
-            </w:r>
-            <w:r>
-              <w:rPr>
-                <w:lang w:val="en-US"/>
-              </w:rPr>
-              <w:t xml:space="preserve">  </w:t>
-            </w:r>
-            <w:r>
-              <w:rPr>
-                <w:b/>
-                <w:bCs/>
-                <w:sz w:val="24"/>
-                <w:szCs w:val="28"/>
-                <w:lang w:val="en-US"/>
-              </w:rPr>
-              <w:sym w:font="Wingdings" w:char="F0A8"/>
-            </w:r>
-            <w:r>
-              <w:rPr>
-                <w:b/>
-                <w:bCs/>
-                <w:lang w:val="en-US"/>
-              </w:rPr>
-              <w:t xml:space="preserve"> </w:t>
-            </w:r>
-            <w:r>
-              <w:rPr>
-                <w:lang w:val="en-US"/>
-              </w:rPr>
-              <w:t>26-3</w:t>
-            </w:r>
-            <w:r>
-              <w:rPr>
-                <w:lang w:val="en-US"/>
-              </w:rPr>
-              <w:t>5</w:t>
-            </w:r>
-            <w:r>
-              <w:rPr>
-                <w:lang w:val="en-US"/>
-              </w:rPr>
-              <w:t xml:space="preserve"> </w:t>
-            </w:r>
-            <w:r>
-              <w:rPr>
-                <w:lang w:val="en-US"/>
-              </w:rPr>
-              <w:t xml:space="preserve">   </w:t>
-            </w:r>
-            <w:r>
-              <w:rPr>
-                <w:b/>
-                <w:bCs/>
-                <w:sz w:val="24"/>
-                <w:szCs w:val="28"/>
-                <w:lang w:val="en-US"/>
-              </w:rPr>
-              <w:sym w:font="Wingdings" w:char="F0A8"/>
-            </w:r>
-            <w:r>
-              <w:rPr>
-                <w:lang w:val="en-US"/>
-              </w:rPr>
-              <w:t xml:space="preserve"> 36-4</w:t>
-            </w:r>
-            <w:r>
-              <w:rPr>
-                <w:lang w:val="en-US"/>
-              </w:rPr>
-              <w:t>5</w:t>
-            </w:r>
-            <w:r>
-              <w:rPr>
-                <w:lang w:val="en-US"/>
-              </w:rPr>
-              <w:t xml:space="preserve"> </w:t>
-            </w:r>
-            <w:r>
-              <w:rPr>
-                <w:lang w:val="en-US"/>
-              </w:rPr>
-              <w:t xml:space="preserve">   </w:t>
-            </w:r>
-            <w:r>
-              <w:rPr>
-                <w:b/>
-                <w:bCs/>
-                <w:sz w:val="24"/>
-                <w:szCs w:val="28"/>
-                <w:lang w:val="en-US"/>
-              </w:rPr>
-              <w:sym w:font="Wingdings" w:char="F0A8"/>
-            </w:r>
-            <w:r>
-              <w:rPr>
-                <w:b/>
-                <w:bCs/>
-                <w:lang w:val="en-US"/>
-              </w:rPr>
-              <w:t xml:space="preserve"> </w:t>
-            </w:r>
-            <w:r>
-              <w:rPr>
-                <w:lang w:val="en-US"/>
-              </w:rPr>
-              <w:t>4</w:t>
-            </w:r>
-            <w:r>
-              <w:rPr>
-                <w:lang w:val="en-US"/>
-              </w:rPr>
-              <w:t>6</w:t>
-            </w:r>
-            <w:r>
-              <w:rPr>
-                <w:lang w:val="en-US"/>
-              </w:rPr>
-              <w:t>-5</w:t>
-            </w:r>
-            <w:r>
-              <w:rPr>
-                <w:lang w:val="en-US"/>
-              </w:rPr>
-              <w:t>5</w:t>
-            </w:r>
-            <w:r>
-              <w:rPr>
-                <w:lang w:val="en-US"/>
-              </w:rPr>
-              <w:t xml:space="preserve"> </w:t>
-            </w:r>
-            <w:r>
-              <w:rPr>
-                <w:lang w:val="en-US"/>
-              </w:rPr>
-              <w:t xml:space="preserve">   </w:t>
-            </w:r>
-            <w:r>
-              <w:rPr>
-                <w:b/>
-                <w:bCs/>
-                <w:sz w:val="24"/>
-                <w:szCs w:val="28"/>
-                <w:lang w:val="en-US"/>
-              </w:rPr>
-              <w:sym w:font="Wingdings" w:char="F0A8"/>
-            </w:r>
-            <w:r>
-              <w:rPr>
-                <w:lang w:val="en-US"/>
-              </w:rPr>
-              <w:t xml:space="preserve"> 56+</w:t>
-            </w:r>
-            <w:r>
-              <w:rPr>
-                <w:lang w:val="en-US"/>
-              </w:rPr>
-              <w:t xml:space="preserve">   </w:t>
-            </w:r>
-          </w:p>
-        </w:tc>
-      </w:tr>
-      <w:tr>
-        <w:tblPrEx>
-          <w:tblBorders>
-            <w:top w:val="single" w:sz="4" w:space="0" w:color="auto"/>
-            <w:left w:val="single" w:sz="4" w:space="0" w:color="auto"/>
-            <w:bottom w:val="single" w:sz="4" w:space="0" w:color="auto"/>
-            <w:right w:val="single" w:sz="4" w:space="0" w:color="auto"/>
-          </w:tblBorders>
-        </w:tblPrEx>
-        <w:tc>
-          <w:tcPr>
-            <w:tcW w:w="0" w:type="auto"/>
-            <w:tcBorders>
-              <w:top w:val="nil"/>
-              <w:left w:val="nil"/>
-              <w:bottom w:val="nil"/>
-              <w:right w:val="nil"/>
-            </w:tcBorders>
-            <w:shd w:val="clear" w:color="auto" w:fill="F2F2F2" w:themeFill="background1" w:themeFillShade="F2"/>
-            <w:tcMar>
-              <w:top w:w="100" w:type="dxa"/>
-              <w:left w:w="160" w:type="dxa"/>
-              <w:bottom w:w="100" w:type="dxa"/>
-              <w:right w:w="120" w:type="dxa"/>
-            </w:tcMar>
-            <w:vAlign w:val="center"/>
-          </w:tcPr>
-          <w:p>
-            <w:pPr>
-              <w:jc w:val="center"/>
-              <w:rPr>
-                <w:color w:val="2E6DA4"/>
-                <w:sz w:val="26"/>
-                <w:szCs w:val="26"/>
-              </w:rPr>
-            </w:pPr>
-          </w:p>
-        </w:tc>
-        <w:tc>
-          <w:tcPr>
-            <w:tcW w:w="4660" w:type="dxa"/>
-            <w:tcBorders>
-              <w:top w:val="nil"/>
-              <w:left w:val="nil"/>
-              <w:bottom w:val="nil"/>
-              <w:right w:val="nil"/>
-            </w:tcBorders>
-            <w:shd w:val="clear" w:color="auto" w:fill="F2F2F2" w:themeFill="background1" w:themeFillShade="F2"/>
-            <w:tcMar>
-              <w:top w:w="100" w:type="dxa"/>
-              <w:left w:w="140" w:type="dxa"/>
-              <w:bottom w:w="100" w:type="dxa"/>
-              <w:right w:w="120" w:type="dxa"/>
-            </w:tcMar>
-          </w:tcPr>
-          <w:p>
-            <w:pPr>
-              <w:rPr>
-                <w:lang w:val="en-US"/>
-              </w:rPr>
-            </w:pPr>
-            <w:r>
-              <w:rPr>
-                <w:b/>
-                <w:bCs/>
-                <w:lang w:val="en-US"/>
-              </w:rPr>
-              <w:t>Your gender:</w:t>
-            </w:r>
-            <w:r>
-              <w:rPr>
-                <w:b/>
-                <w:bCs/>
-                <w:lang w:val="en-US"/>
-              </w:rPr>
-              <w:br/>
-            </w:r>
-            <w:r>
-              <w:rPr>
-                <w:i/>
-                <w:iCs/>
-                <w:sz w:val="16"/>
-                <w:szCs w:val="16"/>
-                <w:lang w:val="en-US"/>
-              </w:rPr>
-              <w:t>We ask this solely for demographic purposes.</w:t>
-            </w:r>
-          </w:p>
-        </w:tc>
-        <w:tc>
-          <w:tcPr>
-            <w:tcW w:w="5646" w:type="dxa"/>
-            <w:gridSpan w:val="2"/>
-            <w:tcBorders>
-              <w:top w:val="nil"/>
-              <w:left w:val="nil"/>
-              <w:bottom w:val="nil"/>
-              <w:right w:val="nil"/>
-            </w:tcBorders>
-            <w:shd w:val="clear" w:color="auto" w:fill="F2F2F2" w:themeFill="background1" w:themeFillShade="F2"/>
-          </w:tcPr>
-          <w:p>
-            <w:pPr>
-              <w:rPr>
-                <w:b/>
-                <w:bCs/>
-                <w:lang w:val="en-US"/>
-              </w:rPr>
-            </w:pPr>
-            <w:r>
-              <w:rPr>
-                <w:b/>
-                <w:bCs/>
-                <w:lang w:val="en-US"/>
-              </w:rPr>
-              <w:br/>
-            </w:r>
-            <w:r>
-              <w:rPr>
-                <w:b/>
-                <w:bCs/>
-                <w:sz w:val="24"/>
-                <w:szCs w:val="28"/>
-                <w:lang w:val="en-US"/>
-              </w:rPr>
-              <w:sym w:font="Wingdings" w:char="F0A8"/>
-            </w:r>
-            <w:r>
-              <w:rPr>
-                <w:b/>
-                <w:bCs/>
-                <w:lang w:val="en-US"/>
-              </w:rPr>
-              <w:t xml:space="preserve"> </w:t>
-            </w:r>
-            <w:r>
-              <w:rPr>
-                <w:lang w:val="en-US"/>
-              </w:rPr>
-              <w:t>W</w:t>
-            </w:r>
-            <w:r>
-              <w:rPr>
-                <w:lang w:val="en-US"/>
-              </w:rPr>
-              <w:t>oman</w:t>
-            </w:r>
-            <w:r>
-              <w:rPr>
-                <w:lang w:val="en-US"/>
-              </w:rPr>
-              <w:t xml:space="preserve">  </w:t>
-            </w:r>
-            <w:r>
-              <w:rPr>
-                <w:lang w:val="en-US"/>
-              </w:rPr>
-              <w:t xml:space="preserve"> </w:t>
-            </w:r>
-            <w:r>
-              <w:rPr>
-                <w:b/>
-                <w:bCs/>
-                <w:sz w:val="24"/>
-                <w:szCs w:val="28"/>
-                <w:lang w:val="en-US"/>
-              </w:rPr>
-              <w:sym w:font="Wingdings" w:char="F0A8"/>
-            </w:r>
-            <w:r>
-              <w:rPr>
-                <w:b/>
-                <w:bCs/>
-                <w:lang w:val="en-US"/>
-              </w:rPr>
-              <w:t xml:space="preserve"> </w:t>
-            </w:r>
-            <w:r>
-              <w:rPr>
-                <w:lang w:val="en-US"/>
-              </w:rPr>
-              <w:t>M</w:t>
-            </w:r>
-            <w:r>
-              <w:rPr>
-                <w:lang w:val="en-US"/>
-              </w:rPr>
-              <w:t>an</w:t>
-            </w:r>
-            <w:r>
-              <w:rPr>
-                <w:lang w:val="en-US"/>
-              </w:rPr>
-              <w:t xml:space="preserve"> </w:t>
-            </w:r>
-            <w:r>
-              <w:rPr>
-                <w:lang w:val="en-US"/>
-              </w:rPr>
-              <w:t xml:space="preserve">  </w:t>
-            </w:r>
-            <w:r>
-              <w:rPr>
-                <w:b/>
-                <w:bCs/>
-                <w:sz w:val="24"/>
-                <w:szCs w:val="28"/>
-                <w:lang w:val="en-US"/>
-              </w:rPr>
-              <w:sym w:font="Wingdings" w:char="F0A8"/>
-            </w:r>
-            <w:r>
-              <w:rPr>
-                <w:lang w:val="en-US"/>
-              </w:rPr>
-              <w:t xml:space="preserve"> </w:t>
-            </w:r>
-            <w:r>
-              <w:rPr>
-                <w:lang w:val="en-US"/>
-              </w:rPr>
-              <w:t>O</w:t>
-            </w:r>
-            <w:r>
-              <w:rPr>
-                <w:lang w:val="en-US"/>
-              </w:rPr>
-              <w:t>ther</w:t>
-            </w:r>
-            <w:r>
-              <w:rPr>
-                <w:lang w:val="en-US"/>
-              </w:rPr>
-              <w:t xml:space="preserve"> </w:t>
-            </w:r>
-            <w:r>
-              <w:rPr>
-                <w:lang w:val="en-US"/>
-              </w:rPr>
-              <w:t xml:space="preserve">   </w:t>
-            </w:r>
-            <w:r>
-              <w:rPr>
-                <w:b/>
-                <w:bCs/>
-                <w:sz w:val="24"/>
-                <w:szCs w:val="28"/>
-                <w:lang w:val="en-US"/>
-              </w:rPr>
-              <w:sym w:font="Wingdings" w:char="F0A8"/>
-            </w:r>
-            <w:r>
-              <w:rPr>
-                <w:lang w:val="en-US"/>
-              </w:rPr>
-              <w:t xml:space="preserve"> </w:t>
-            </w:r>
-            <w:r>
-              <w:rPr>
-                <w:lang w:val="en-US"/>
-              </w:rPr>
-              <w:t>P</w:t>
-            </w:r>
-            <w:r>
-              <w:rPr>
-                <w:lang w:val="en-US"/>
-              </w:rPr>
-              <w:t xml:space="preserve">refer not to say </w:t>
+                <w:b/>
+                <w:bCs/>
+                <w:lang w:val="en-US"/>
+              </w:rPr>
+            </w:pPr>
+            <w:r>
+              <w:rPr>
+                <w:b/>
+                <w:bCs/>
+                <w:lang w:val="en-US"/>
+              </w:rPr>
+              <w:t>………………………………………………………………………</w:t>
             </w:r>
           </w:p>
         </w:tc>
@@ -2171,19 +1732,9 @@
         <w:color w:val="6B7B80"/>
         <w:sz w:val="15"/>
         <w:szCs w:val="15"/>
-        <w:lang w:val="nl-NL"/>
-      </w:rPr>
-      <w:t>Th</w:t>
-    </w:r>
-    <w:r>
-      <w:rPr>
-        <w:rFonts w:cs="Arial"/>
-        <w:color w:val="6B7B80"/>
-        <w:sz w:val="15"/>
-        <w:szCs w:val="15"/>
-        <w:lang w:val="nl-NL"/>
-      </w:rPr>
-      <w:t xml:space="preserve">eocharis Tavantzis, </w:t>
+        <w:lang w:val="en-US"/>
+      </w:rPr>
+      <w:t xml:space="preserve">Theocharis Tavantzis, </w:t>
     </w:r>
     <w:r>
       <w:rPr>

</xml_diff>

<commit_message>
Added recording clarification to the informed consent form
</commit_message>
<xml_diff>
--- a/Work Group Guide/Source/Informed Consent Form.docx
+++ b/Work Group Guide/Source/Informed Consent Form.docx
@@ -384,7 +384,19 @@
               <w:rPr>
                 <w:lang w:val="en-US"/>
               </w:rPr>
-              <w:t xml:space="preserve"> are anonymized </w:t>
+              <w:t xml:space="preserve"> </w:t>
+            </w:r>
+            <w:r>
+              <w:rPr>
+                <w:lang w:val="en-US"/>
+              </w:rPr>
+              <w:t xml:space="preserve">and recordings </w:t>
+            </w:r>
+            <w:r>
+              <w:rPr>
+                <w:lang w:val="en-US"/>
+              </w:rPr>
+              <w:t xml:space="preserve">are anonymized </w:t>
             </w:r>
             <w:r>
               <w:rPr>
@@ -1240,23 +1252,7 @@
                 <w:bCs/>
                 <w:lang w:val="en-US"/>
               </w:rPr>
-              <w:t xml:space="preserve">Your </w:t>
-            </w:r>
-            <w:r>
-              <w:rPr>
-                <w:b/>
-                <w:bCs/>
-                <w:lang w:val="en-US"/>
-              </w:rPr>
-              <w:t>name</w:t>
-            </w:r>
-            <w:r>
-              <w:rPr>
-                <w:b/>
-                <w:bCs/>
-                <w:lang w:val="en-US"/>
-              </w:rPr>
-              <w:t>:</w:t>
+              <w:t>Your name:</w:t>
             </w:r>
           </w:p>
         </w:tc>
@@ -1734,7 +1730,29 @@
         <w:szCs w:val="15"/>
         <w:lang w:val="en-US"/>
       </w:rPr>
-      <w:t xml:space="preserve">Theocharis Tavantzis, </w:t>
+      <w:t xml:space="preserve">Theocharis </w:t>
+    </w:r>
+    <w:proofErr w:type="spellStart"/>
+    <w:r>
+      <w:rPr>
+        <w:rFonts w:cs="Arial"/>
+        <w:color w:val="6B7B80"/>
+        <w:sz w:val="15"/>
+        <w:szCs w:val="15"/>
+        <w:lang w:val="en-US"/>
+      </w:rPr>
+      <w:t>Tavantzis</w:t>
+    </w:r>
+    <w:proofErr w:type="spellEnd"/>
+    <w:r>
+      <w:rPr>
+        <w:rFonts w:cs="Arial"/>
+        <w:color w:val="6B7B80"/>
+        <w:sz w:val="15"/>
+        <w:szCs w:val="15"/>
+        <w:lang w:val="en-US"/>
+      </w:rPr>
+      <w:t xml:space="preserve">, </w:t>
     </w:r>
     <w:r>
       <w:rPr>

</xml_diff>

<commit_message>
Updated informed consent forms by re-adding demographics (in case participants dont enter the follow-up survey) AND adding a checkbox to see if the person was a facilitator of the session
</commit_message>
<xml_diff>
--- a/Work Group Guide/Source/Informed Consent Form.docx
+++ b/Work Group Guide/Source/Informed Consent Form.docx
@@ -51,12 +51,16 @@
         <w:tblLook w:val="0000" w:firstRow="0" w:lastRow="0" w:firstColumn="0" w:lastColumn="0" w:noHBand="0" w:noVBand="0"/>
       </w:tblPr>
       <w:tblGrid>
-        <w:gridCol w:w="10800"/>
+        <w:gridCol w:w="494"/>
+        <w:gridCol w:w="4660"/>
+        <w:gridCol w:w="398"/>
+        <w:gridCol w:w="5248"/>
       </w:tblGrid>
       <w:tr>
         <w:tc>
           <w:tcPr>
             <w:tcW w:w="10800" w:type="dxa"/>
+            <w:gridSpan w:val="4"/>
             <w:tcBorders>
               <w:top w:val="none" w:sz="0" w:space="0" w:color="FFFFFF"/>
               <w:left w:val="none" w:sz="0" w:space="0" w:color="FFFFFF"/>
@@ -156,46 +160,6 @@
           </w:p>
         </w:tc>
       </w:tr>
-    </w:tbl>
-    <w:p>
-      <w:pPr>
-        <w:spacing w:after="60"/>
-        <w:rPr>
-          <w:rFonts w:cs="Arial"/>
-        </w:rPr>
-      </w:pPr>
-      <w:r>
-        <w:rPr>
-          <w:rFonts w:cs="Arial"/>
-          <w:sz w:val="8"/>
-          <w:szCs w:val="8"/>
-        </w:rPr>
-        <w:t xml:space="preserve"> </w:t>
-      </w:r>
-    </w:p>
-    <w:tbl>
-      <w:tblPr>
-        <w:tblW w:w="10800" w:type="dxa"/>
-        <w:tblBorders>
-          <w:top w:val="none" w:sz="0" w:space="0" w:color="FFFFFF"/>
-          <w:left w:val="none" w:sz="0" w:space="0" w:color="FFFFFF"/>
-          <w:bottom w:val="none" w:sz="0" w:space="0" w:color="FFFFFF"/>
-          <w:right w:val="none" w:sz="0" w:space="0" w:color="FFFFFF"/>
-          <w:insideH w:val="single" w:sz="4" w:space="0" w:color="auto"/>
-          <w:insideV w:val="single" w:sz="4" w:space="0" w:color="auto"/>
-        </w:tblBorders>
-        <w:tblCellMar>
-          <w:left w:w="10" w:type="dxa"/>
-          <w:right w:w="10" w:type="dxa"/>
-        </w:tblCellMar>
-        <w:tblLook w:val="0000" w:firstRow="0" w:lastRow="0" w:firstColumn="0" w:lastColumn="0" w:noHBand="0" w:noVBand="0"/>
-      </w:tblPr>
-      <w:tblGrid>
-        <w:gridCol w:w="494"/>
-        <w:gridCol w:w="4660"/>
-        <w:gridCol w:w="398"/>
-        <w:gridCol w:w="5248"/>
-      </w:tblGrid>
       <w:tr>
         <w:tc>
           <w:tcPr>
@@ -226,6 +190,14 @@
             <w:r>
               <w:rPr>
                 <w:rFonts w:cs="Arial"/>
+                <w:sz w:val="8"/>
+                <w:szCs w:val="8"/>
+              </w:rPr>
+              <w:t xml:space="preserve"> </w:t>
+            </w:r>
+            <w:r>
+              <w:rPr>
+                <w:rFonts w:cs="Arial"/>
                 <w:b/>
                 <w:bCs/>
                 <w:color w:val="FFFFFF"/>
@@ -324,7 +296,19 @@
               <w:rPr>
                 <w:lang w:val="en-US"/>
               </w:rPr>
-              <w:t>Share your experiences and opinions on AI adoption in your organization.</w:t>
+              <w:t>Share your experiences and opinions on AI adoption in your organization</w:t>
+            </w:r>
+            <w:r>
+              <w:rPr>
+                <w:lang w:val="en-US"/>
+              </w:rPr>
+              <w:t xml:space="preserve"> or more broadly</w:t>
+            </w:r>
+            <w:r>
+              <w:rPr>
+                <w:lang w:val="en-US"/>
+              </w:rPr>
+              <w:t>.</w:t>
             </w:r>
           </w:p>
           <w:p>
@@ -378,60 +362,6 @@
               <w:rPr>
                 <w:lang w:val="en-US"/>
               </w:rPr>
-              <w:t>Written outputs</w:t>
-            </w:r>
-            <w:r>
-              <w:rPr>
-                <w:lang w:val="en-US"/>
-              </w:rPr>
-              <w:t xml:space="preserve"> </w:t>
-            </w:r>
-            <w:r>
-              <w:rPr>
-                <w:lang w:val="en-US"/>
-              </w:rPr>
-              <w:t xml:space="preserve">and recordings </w:t>
-            </w:r>
-            <w:r>
-              <w:rPr>
-                <w:lang w:val="en-US"/>
-              </w:rPr>
-              <w:t xml:space="preserve">are anonymized </w:t>
-            </w:r>
-            <w:r>
-              <w:rPr>
-                <w:lang w:val="en-US"/>
-              </w:rPr>
-              <w:t xml:space="preserve">and scrubbed of business-sensitive information </w:t>
-            </w:r>
-            <w:r>
-              <w:rPr>
-                <w:lang w:val="en-US"/>
-              </w:rPr>
-              <w:t>by the facilitator and then</w:t>
-            </w:r>
-            <w:r>
-              <w:rPr>
-                <w:lang w:val="en-US"/>
-              </w:rPr>
-              <w:t xml:space="preserve"> shared with the research initiative for analysis.</w:t>
-            </w:r>
-          </w:p>
-          <w:p>
-            <w:pPr>
-              <w:pStyle w:val="ListParagraph"/>
-              <w:numPr>
-                <w:ilvl w:val="0"/>
-                <w:numId w:val="3"/>
-              </w:numPr>
-              <w:rPr>
-                <w:lang w:val="en-US"/>
-              </w:rPr>
-            </w:pPr>
-            <w:r>
-              <w:rPr>
-                <w:lang w:val="en-US"/>
-              </w:rPr>
               <w:t>Receive a short follow-up survey if you provide your email address.</w:t>
             </w:r>
           </w:p>
@@ -675,8 +605,6 @@
           </w:p>
           <w:p>
             <w:pPr>
-              <w:pStyle w:val="ListParagraph"/>
-              <w:ind w:left="360"/>
               <w:rPr>
                 <w:lang w:val="en-US"/>
               </w:rPr>
@@ -840,9 +768,21 @@
                 <w:ilvl w:val="0"/>
                 <w:numId w:val="6"/>
               </w:numPr>
-            </w:pPr>
-            <w:r>
-              <w:t>All responses are anonymised before any analysis or publication.</w:t>
+              <w:rPr>
+                <w:lang w:val="en-US"/>
+              </w:rPr>
+            </w:pPr>
+            <w:r>
+              <w:rPr>
+                <w:lang w:val="en-US"/>
+              </w:rPr>
+              <w:t>All collected data is anonymized and scrubbed of business-sensitive information by the facilitator and then</w:t>
+            </w:r>
+            <w:r>
+              <w:rPr>
+                <w:lang w:val="en-US"/>
+              </w:rPr>
+              <w:t xml:space="preserve"> shared with the research initiative for analysis.</w:t>
             </w:r>
           </w:p>
           <w:p>
@@ -878,7 +818,16 @@
               </w:numPr>
             </w:pPr>
             <w:r>
-              <w:t>No commercially sensitive or personal information is attributed to you.</w:t>
+              <w:t>No commercially sensitive or personal information is attribut</w:t>
+            </w:r>
+            <w:r>
+              <w:rPr>
+                <w:lang w:val="en-US"/>
+              </w:rPr>
+              <w:t>able</w:t>
+            </w:r>
+            <w:r>
+              <w:t xml:space="preserve"> to you.</w:t>
             </w:r>
           </w:p>
           <w:p>
@@ -972,11 +921,14 @@
               <w:pStyle w:val="ListParagraph"/>
               <w:numPr>
                 <w:ilvl w:val="0"/>
-                <w:numId w:val="8"/>
+                <w:numId w:val="6"/>
               </w:numPr>
             </w:pPr>
             <w:r>
-              <w:t>Research findings are released to the global community under a Creative Commons licence.</w:t>
+              <w:rPr>
+                <w:lang w:val="en-US"/>
+              </w:rPr>
+              <w:t>Collaboratively created outcomes are shared publicly on GitHub as part of the research initiative.</w:t>
             </w:r>
           </w:p>
           <w:p>
@@ -984,11 +936,11 @@
               <w:pStyle w:val="ListParagraph"/>
               <w:numPr>
                 <w:ilvl w:val="0"/>
-                <w:numId w:val="8"/>
+                <w:numId w:val="6"/>
               </w:numPr>
             </w:pPr>
             <w:r>
-              <w:t>Submitted to peer-reviewed academic journals or scientific conferences.</w:t>
+              <w:t>Research findings are released to the global community under a Creative Commons licence.</w:t>
             </w:r>
           </w:p>
           <w:p>
@@ -996,7 +948,19 @@
               <w:pStyle w:val="ListParagraph"/>
               <w:numPr>
                 <w:ilvl w:val="0"/>
-                <w:numId w:val="8"/>
+                <w:numId w:val="6"/>
+              </w:numPr>
+            </w:pPr>
+            <w:r>
+              <w:t>Submitted to peer-reviewed academic journals or scientific conferences.</w:t>
+            </w:r>
+          </w:p>
+          <w:p>
+            <w:pPr>
+              <w:pStyle w:val="ListParagraph"/>
+              <w:numPr>
+                <w:ilvl w:val="0"/>
+                <w:numId w:val="6"/>
               </w:numPr>
             </w:pPr>
             <w:r>
@@ -1214,16 +1178,31 @@
             <w:pPr>
               <w:jc w:val="center"/>
               <w:rPr>
-                <w:color w:val="2E6DA4"/>
-                <w:sz w:val="26"/>
-                <w:szCs w:val="26"/>
-              </w:rPr>
-            </w:pPr>
+                <w:b/>
+                <w:bCs/>
+                <w:color w:val="222222"/>
+                <w:sz w:val="24"/>
+                <w:szCs w:val="28"/>
+                <w:lang w:val="en-US"/>
+              </w:rPr>
+            </w:pPr>
+            <w:r>
+              <w:rPr>
+                <w:b/>
+                <w:bCs/>
+                <w:color w:val="222222"/>
+                <w:sz w:val="24"/>
+                <w:szCs w:val="28"/>
+                <w:lang w:val="en-US"/>
+              </w:rPr>
+              <w:sym w:font="Wingdings" w:char="F0A8"/>
+            </w:r>
           </w:p>
         </w:tc>
         <w:tc>
           <w:tcPr>
-            <w:tcW w:w="4660" w:type="dxa"/>
+            <w:tcW w:w="10306" w:type="dxa"/>
+            <w:gridSpan w:val="3"/>
             <w:tcBorders>
               <w:top w:val="nil"/>
               <w:left w:val="nil"/>
@@ -1241,48 +1220,14 @@
           <w:p>
             <w:pPr>
               <w:rPr>
-                <w:b/>
-                <w:bCs/>
-                <w:lang w:val="en-US"/>
-              </w:rPr>
-            </w:pPr>
-            <w:r>
-              <w:rPr>
-                <w:b/>
-                <w:bCs/>
-                <w:lang w:val="en-US"/>
-              </w:rPr>
-              <w:t>Your name:</w:t>
-            </w:r>
-          </w:p>
-        </w:tc>
-        <w:tc>
-          <w:tcPr>
-            <w:tcW w:w="5646" w:type="dxa"/>
-            <w:gridSpan w:val="2"/>
-            <w:tcBorders>
-              <w:top w:val="nil"/>
-              <w:left w:val="nil"/>
-              <w:bottom w:val="nil"/>
-              <w:right w:val="nil"/>
-            </w:tcBorders>
-            <w:shd w:val="clear" w:color="auto" w:fill="F2F2F2" w:themeFill="background1" w:themeFillShade="F2"/>
-          </w:tcPr>
-          <w:p>
-            <w:pPr>
-              <w:rPr>
-                <w:b/>
-                <w:bCs/>
-                <w:lang w:val="en-US"/>
-              </w:rPr>
-            </w:pPr>
-            <w:r>
-              <w:rPr>
-                <w:b/>
-                <w:bCs/>
-                <w:lang w:val="en-US"/>
-              </w:rPr>
-              <w:t>………………………………………………………………………</w:t>
+                <w:lang w:val="en-US"/>
+              </w:rPr>
+            </w:pPr>
+            <w:r>
+              <w:rPr>
+                <w:lang w:val="en-US"/>
+              </w:rPr>
+              <w:t>I was facilitator for this session</w:t>
             </w:r>
           </w:p>
         </w:tc>
@@ -1316,11 +1261,11 @@
           </w:tcPr>
           <w:p>
             <w:pPr>
-              <w:jc w:val="center"/>
               <w:rPr>
                 <w:color w:val="2E6DA4"/>
                 <w:sz w:val="26"/>
                 <w:szCs w:val="26"/>
+                <w:lang w:val="en-US"/>
               </w:rPr>
             </w:pPr>
           </w:p>
@@ -1356,7 +1301,7 @@
                 <w:bCs/>
                 <w:lang w:val="en-US"/>
               </w:rPr>
-              <w:t>Your role in the organization:</w:t>
+              <w:t>Your name:</w:t>
             </w:r>
           </w:p>
         </w:tc>
@@ -1460,23 +1405,7 @@
                 <w:bCs/>
                 <w:lang w:val="en-US"/>
               </w:rPr>
-              <w:t>E-mail address</w:t>
-            </w:r>
-            <w:r>
-              <w:rPr>
-                <w:b/>
-                <w:bCs/>
-                <w:lang w:val="en-US"/>
-              </w:rPr>
-              <w:t xml:space="preserve"> (optional)</w:t>
-            </w:r>
-            <w:r>
-              <w:rPr>
-                <w:b/>
-                <w:bCs/>
-                <w:lang w:val="en-US"/>
-              </w:rPr>
-              <w:t>:</w:t>
+              <w:t>E-mail address:</w:t>
             </w:r>
           </w:p>
           <w:p>
@@ -1526,6 +1455,559 @@
                 <w:lang w:val="en-US"/>
               </w:rPr>
               <w:t>………………………………………………………………………</w:t>
+            </w:r>
+          </w:p>
+        </w:tc>
+      </w:tr>
+      <w:tr>
+        <w:tblPrEx>
+          <w:tblBorders>
+            <w:top w:val="single" w:sz="4" w:space="0" w:color="auto"/>
+            <w:left w:val="single" w:sz="4" w:space="0" w:color="auto"/>
+            <w:bottom w:val="single" w:sz="4" w:space="0" w:color="auto"/>
+            <w:right w:val="single" w:sz="4" w:space="0" w:color="auto"/>
+          </w:tblBorders>
+        </w:tblPrEx>
+        <w:tc>
+          <w:tcPr>
+            <w:tcW w:w="0" w:type="auto"/>
+            <w:tcBorders>
+              <w:top w:val="nil"/>
+              <w:left w:val="nil"/>
+              <w:bottom w:val="nil"/>
+              <w:right w:val="nil"/>
+            </w:tcBorders>
+            <w:shd w:val="clear" w:color="auto" w:fill="F2F2F2" w:themeFill="background1" w:themeFillShade="F2"/>
+            <w:tcMar>
+              <w:top w:w="100" w:type="dxa"/>
+              <w:left w:w="160" w:type="dxa"/>
+              <w:bottom w:w="100" w:type="dxa"/>
+              <w:right w:w="120" w:type="dxa"/>
+            </w:tcMar>
+            <w:vAlign w:val="center"/>
+          </w:tcPr>
+          <w:p>
+            <w:pPr>
+              <w:rPr>
+                <w:color w:val="2E6DA4"/>
+                <w:sz w:val="26"/>
+                <w:szCs w:val="26"/>
+                <w:lang w:val="en-US"/>
+              </w:rPr>
+            </w:pPr>
+          </w:p>
+        </w:tc>
+        <w:tc>
+          <w:tcPr>
+            <w:tcW w:w="4660" w:type="dxa"/>
+            <w:tcBorders>
+              <w:top w:val="nil"/>
+              <w:left w:val="nil"/>
+              <w:bottom w:val="nil"/>
+              <w:right w:val="nil"/>
+            </w:tcBorders>
+            <w:shd w:val="clear" w:color="auto" w:fill="F2F2F2" w:themeFill="background1" w:themeFillShade="F2"/>
+            <w:tcMar>
+              <w:top w:w="100" w:type="dxa"/>
+              <w:left w:w="140" w:type="dxa"/>
+              <w:bottom w:w="100" w:type="dxa"/>
+              <w:right w:w="120" w:type="dxa"/>
+            </w:tcMar>
+          </w:tcPr>
+          <w:p>
+            <w:pPr>
+              <w:rPr>
+                <w:b/>
+                <w:bCs/>
+                <w:lang w:val="en-US"/>
+              </w:rPr>
+            </w:pPr>
+            <w:r>
+              <w:rPr>
+                <w:b/>
+                <w:bCs/>
+                <w:lang w:val="en-US"/>
+              </w:rPr>
+              <w:t>Your role in the organization:</w:t>
+            </w:r>
+          </w:p>
+        </w:tc>
+        <w:tc>
+          <w:tcPr>
+            <w:tcW w:w="5646" w:type="dxa"/>
+            <w:gridSpan w:val="2"/>
+            <w:tcBorders>
+              <w:top w:val="nil"/>
+              <w:left w:val="nil"/>
+              <w:bottom w:val="nil"/>
+              <w:right w:val="nil"/>
+            </w:tcBorders>
+            <w:shd w:val="clear" w:color="auto" w:fill="F2F2F2" w:themeFill="background1" w:themeFillShade="F2"/>
+          </w:tcPr>
+          <w:p>
+            <w:pPr>
+              <w:rPr>
+                <w:b/>
+                <w:bCs/>
+                <w:lang w:val="en-US"/>
+              </w:rPr>
+            </w:pPr>
+            <w:r>
+              <w:rPr>
+                <w:b/>
+                <w:bCs/>
+                <w:lang w:val="en-US"/>
+              </w:rPr>
+              <w:t>………………………………………………………………………</w:t>
+            </w:r>
+          </w:p>
+        </w:tc>
+      </w:tr>
+      <w:tr>
+        <w:tblPrEx>
+          <w:tblBorders>
+            <w:top w:val="single" w:sz="4" w:space="0" w:color="auto"/>
+            <w:left w:val="single" w:sz="4" w:space="0" w:color="auto"/>
+            <w:bottom w:val="single" w:sz="4" w:space="0" w:color="auto"/>
+            <w:right w:val="single" w:sz="4" w:space="0" w:color="auto"/>
+          </w:tblBorders>
+        </w:tblPrEx>
+        <w:tc>
+          <w:tcPr>
+            <w:tcW w:w="0" w:type="auto"/>
+            <w:tcBorders>
+              <w:top w:val="nil"/>
+              <w:left w:val="nil"/>
+              <w:bottom w:val="nil"/>
+              <w:right w:val="nil"/>
+            </w:tcBorders>
+            <w:shd w:val="clear" w:color="auto" w:fill="F2F2F2" w:themeFill="background1" w:themeFillShade="F2"/>
+            <w:tcMar>
+              <w:top w:w="100" w:type="dxa"/>
+              <w:left w:w="160" w:type="dxa"/>
+              <w:bottom w:w="100" w:type="dxa"/>
+              <w:right w:w="120" w:type="dxa"/>
+            </w:tcMar>
+            <w:vAlign w:val="center"/>
+          </w:tcPr>
+          <w:p>
+            <w:pPr>
+              <w:rPr>
+                <w:color w:val="2E6DA4"/>
+                <w:sz w:val="26"/>
+                <w:szCs w:val="26"/>
+                <w:lang w:val="en-US"/>
+              </w:rPr>
+            </w:pPr>
+          </w:p>
+        </w:tc>
+        <w:tc>
+          <w:tcPr>
+            <w:tcW w:w="4660" w:type="dxa"/>
+            <w:tcBorders>
+              <w:top w:val="nil"/>
+              <w:left w:val="nil"/>
+              <w:bottom w:val="nil"/>
+              <w:right w:val="nil"/>
+            </w:tcBorders>
+            <w:shd w:val="clear" w:color="auto" w:fill="F2F2F2" w:themeFill="background1" w:themeFillShade="F2"/>
+            <w:tcMar>
+              <w:top w:w="100" w:type="dxa"/>
+              <w:left w:w="140" w:type="dxa"/>
+              <w:bottom w:w="100" w:type="dxa"/>
+              <w:right w:w="120" w:type="dxa"/>
+            </w:tcMar>
+          </w:tcPr>
+          <w:p>
+            <w:pPr>
+              <w:rPr>
+                <w:b/>
+                <w:bCs/>
+                <w:lang w:val="en-US"/>
+              </w:rPr>
+            </w:pPr>
+            <w:r>
+              <w:rPr>
+                <w:b/>
+                <w:bCs/>
+                <w:lang w:val="en-US"/>
+              </w:rPr>
+              <w:t>Your age group:</w:t>
+            </w:r>
+          </w:p>
+          <w:p>
+            <w:pPr>
+              <w:rPr>
+                <w:i/>
+                <w:iCs/>
+                <w:lang w:val="en-US"/>
+              </w:rPr>
+            </w:pPr>
+            <w:r>
+              <w:rPr>
+                <w:i/>
+                <w:iCs/>
+                <w:sz w:val="16"/>
+                <w:szCs w:val="16"/>
+                <w:lang w:val="en-US"/>
+              </w:rPr>
+              <w:t>We ask this solely for demographic purposes.</w:t>
+            </w:r>
+          </w:p>
+        </w:tc>
+        <w:tc>
+          <w:tcPr>
+            <w:tcW w:w="5646" w:type="dxa"/>
+            <w:gridSpan w:val="2"/>
+            <w:tcBorders>
+              <w:top w:val="nil"/>
+              <w:left w:val="nil"/>
+              <w:bottom w:val="nil"/>
+              <w:right w:val="nil"/>
+            </w:tcBorders>
+            <w:shd w:val="clear" w:color="auto" w:fill="F2F2F2" w:themeFill="background1" w:themeFillShade="F2"/>
+          </w:tcPr>
+          <w:p>
+            <w:pPr>
+              <w:rPr>
+                <w:lang w:val="en-US"/>
+              </w:rPr>
+            </w:pPr>
+            <w:r>
+              <w:rPr>
+                <w:b/>
+                <w:bCs/>
+                <w:lang w:val="en-US"/>
+              </w:rPr>
+              <w:br/>
+            </w:r>
+            <w:r>
+              <w:rPr>
+                <w:b/>
+                <w:bCs/>
+                <w:sz w:val="24"/>
+                <w:szCs w:val="28"/>
+                <w:lang w:val="en-US"/>
+              </w:rPr>
+              <w:sym w:font="Wingdings" w:char="F0A8"/>
+            </w:r>
+            <w:r>
+              <w:rPr>
+                <w:b/>
+                <w:bCs/>
+                <w:lang w:val="en-US"/>
+              </w:rPr>
+              <w:t xml:space="preserve"> </w:t>
+            </w:r>
+            <w:r>
+              <w:rPr>
+                <w:lang w:val="en-US"/>
+              </w:rPr>
+              <w:t xml:space="preserve">18-25   </w:t>
+            </w:r>
+            <w:r>
+              <w:rPr>
+                <w:b/>
+                <w:bCs/>
+                <w:sz w:val="24"/>
+                <w:szCs w:val="28"/>
+                <w:lang w:val="en-US"/>
+              </w:rPr>
+              <w:sym w:font="Wingdings" w:char="F0A8"/>
+            </w:r>
+            <w:r>
+              <w:rPr>
+                <w:b/>
+                <w:bCs/>
+                <w:lang w:val="en-US"/>
+              </w:rPr>
+              <w:t xml:space="preserve"> </w:t>
+            </w:r>
+            <w:r>
+              <w:rPr>
+                <w:lang w:val="en-US"/>
+              </w:rPr>
+              <w:t xml:space="preserve">26-35    </w:t>
+            </w:r>
+            <w:r>
+              <w:rPr>
+                <w:b/>
+                <w:bCs/>
+                <w:sz w:val="24"/>
+                <w:szCs w:val="28"/>
+                <w:lang w:val="en-US"/>
+              </w:rPr>
+              <w:sym w:font="Wingdings" w:char="F0A8"/>
+            </w:r>
+            <w:r>
+              <w:rPr>
+                <w:lang w:val="en-US"/>
+              </w:rPr>
+              <w:t xml:space="preserve"> 36-45    </w:t>
+            </w:r>
+            <w:r>
+              <w:rPr>
+                <w:b/>
+                <w:bCs/>
+                <w:sz w:val="24"/>
+                <w:szCs w:val="28"/>
+                <w:lang w:val="en-US"/>
+              </w:rPr>
+              <w:sym w:font="Wingdings" w:char="F0A8"/>
+            </w:r>
+            <w:r>
+              <w:rPr>
+                <w:b/>
+                <w:bCs/>
+                <w:lang w:val="en-US"/>
+              </w:rPr>
+              <w:t xml:space="preserve"> </w:t>
+            </w:r>
+            <w:r>
+              <w:rPr>
+                <w:lang w:val="en-US"/>
+              </w:rPr>
+              <w:t xml:space="preserve">46-55    </w:t>
+            </w:r>
+            <w:r>
+              <w:rPr>
+                <w:b/>
+                <w:bCs/>
+                <w:sz w:val="24"/>
+                <w:szCs w:val="28"/>
+                <w:lang w:val="en-US"/>
+              </w:rPr>
+              <w:sym w:font="Wingdings" w:char="F0A8"/>
+            </w:r>
+            <w:r>
+              <w:rPr>
+                <w:lang w:val="en-US"/>
+              </w:rPr>
+              <w:t xml:space="preserve"> 56+</w:t>
+            </w:r>
+            <w:r>
+              <w:rPr>
+                <w:lang w:val="en-US"/>
+              </w:rPr>
+              <w:t xml:space="preserve">   </w:t>
+            </w:r>
+          </w:p>
+        </w:tc>
+      </w:tr>
+      <w:tr>
+        <w:tblPrEx>
+          <w:tblBorders>
+            <w:top w:val="single" w:sz="4" w:space="0" w:color="auto"/>
+            <w:left w:val="single" w:sz="4" w:space="0" w:color="auto"/>
+            <w:bottom w:val="single" w:sz="4" w:space="0" w:color="auto"/>
+            <w:right w:val="single" w:sz="4" w:space="0" w:color="auto"/>
+          </w:tblBorders>
+        </w:tblPrEx>
+        <w:tc>
+          <w:tcPr>
+            <w:tcW w:w="0" w:type="auto"/>
+            <w:tcBorders>
+              <w:top w:val="nil"/>
+              <w:left w:val="nil"/>
+              <w:bottom w:val="nil"/>
+              <w:right w:val="nil"/>
+            </w:tcBorders>
+            <w:shd w:val="clear" w:color="auto" w:fill="F2F2F2" w:themeFill="background1" w:themeFillShade="F2"/>
+            <w:tcMar>
+              <w:top w:w="100" w:type="dxa"/>
+              <w:left w:w="160" w:type="dxa"/>
+              <w:bottom w:w="100" w:type="dxa"/>
+              <w:right w:w="120" w:type="dxa"/>
+            </w:tcMar>
+            <w:vAlign w:val="center"/>
+          </w:tcPr>
+          <w:p>
+            <w:pPr>
+              <w:jc w:val="center"/>
+              <w:rPr>
+                <w:color w:val="2E6DA4"/>
+                <w:sz w:val="26"/>
+                <w:szCs w:val="26"/>
+              </w:rPr>
+            </w:pPr>
+          </w:p>
+        </w:tc>
+        <w:tc>
+          <w:tcPr>
+            <w:tcW w:w="4660" w:type="dxa"/>
+            <w:tcBorders>
+              <w:top w:val="nil"/>
+              <w:left w:val="nil"/>
+              <w:bottom w:val="nil"/>
+              <w:right w:val="nil"/>
+            </w:tcBorders>
+            <w:shd w:val="clear" w:color="auto" w:fill="F2F2F2" w:themeFill="background1" w:themeFillShade="F2"/>
+            <w:tcMar>
+              <w:top w:w="100" w:type="dxa"/>
+              <w:left w:w="140" w:type="dxa"/>
+              <w:bottom w:w="100" w:type="dxa"/>
+              <w:right w:w="120" w:type="dxa"/>
+            </w:tcMar>
+          </w:tcPr>
+          <w:p>
+            <w:pPr>
+              <w:rPr>
+                <w:lang w:val="en-US"/>
+              </w:rPr>
+            </w:pPr>
+            <w:r>
+              <w:rPr>
+                <w:b/>
+                <w:bCs/>
+                <w:lang w:val="en-US"/>
+              </w:rPr>
+              <w:t>Your gender:</w:t>
+            </w:r>
+            <w:r>
+              <w:rPr>
+                <w:b/>
+                <w:bCs/>
+                <w:lang w:val="en-US"/>
+              </w:rPr>
+              <w:br/>
+            </w:r>
+            <w:r>
+              <w:rPr>
+                <w:i/>
+                <w:iCs/>
+                <w:sz w:val="16"/>
+                <w:szCs w:val="16"/>
+                <w:lang w:val="en-US"/>
+              </w:rPr>
+              <w:t>We ask this solely for demographic purposes.</w:t>
+            </w:r>
+          </w:p>
+        </w:tc>
+        <w:tc>
+          <w:tcPr>
+            <w:tcW w:w="5646" w:type="dxa"/>
+            <w:gridSpan w:val="2"/>
+            <w:tcBorders>
+              <w:top w:val="nil"/>
+              <w:left w:val="nil"/>
+              <w:bottom w:val="nil"/>
+              <w:right w:val="nil"/>
+            </w:tcBorders>
+            <w:shd w:val="clear" w:color="auto" w:fill="F2F2F2" w:themeFill="background1" w:themeFillShade="F2"/>
+          </w:tcPr>
+          <w:p>
+            <w:pPr>
+              <w:rPr>
+                <w:b/>
+                <w:bCs/>
+                <w:lang w:val="en-US"/>
+              </w:rPr>
+            </w:pPr>
+            <w:r>
+              <w:rPr>
+                <w:b/>
+                <w:bCs/>
+                <w:lang w:val="en-US"/>
+              </w:rPr>
+              <w:br/>
+            </w:r>
+            <w:r>
+              <w:rPr>
+                <w:b/>
+                <w:bCs/>
+                <w:sz w:val="24"/>
+                <w:szCs w:val="28"/>
+                <w:lang w:val="en-US"/>
+              </w:rPr>
+              <w:sym w:font="Wingdings" w:char="F0A8"/>
+            </w:r>
+            <w:r>
+              <w:rPr>
+                <w:b/>
+                <w:bCs/>
+                <w:lang w:val="en-US"/>
+              </w:rPr>
+              <w:t xml:space="preserve"> </w:t>
+            </w:r>
+            <w:r>
+              <w:rPr>
+                <w:lang w:val="en-US"/>
+              </w:rPr>
+              <w:t xml:space="preserve">Woman   </w:t>
+            </w:r>
+            <w:r>
+              <w:rPr>
+                <w:b/>
+                <w:bCs/>
+                <w:sz w:val="24"/>
+                <w:szCs w:val="28"/>
+                <w:lang w:val="en-US"/>
+              </w:rPr>
+              <w:sym w:font="Wingdings" w:char="F0A8"/>
+            </w:r>
+            <w:r>
+              <w:rPr>
+                <w:b/>
+                <w:bCs/>
+                <w:lang w:val="en-US"/>
+              </w:rPr>
+              <w:t xml:space="preserve"> </w:t>
+            </w:r>
+            <w:r>
+              <w:rPr>
+                <w:lang w:val="en-US"/>
+              </w:rPr>
+              <w:t>Man</w:t>
+            </w:r>
+            <w:r>
+              <w:rPr>
+                <w:lang w:val="en-US"/>
+              </w:rPr>
+              <w:t xml:space="preserve">   </w:t>
+            </w:r>
+            <w:r>
+              <w:rPr>
+                <w:b/>
+                <w:bCs/>
+                <w:sz w:val="24"/>
+                <w:szCs w:val="28"/>
+                <w:lang w:val="en-US"/>
+              </w:rPr>
+              <w:sym w:font="Wingdings" w:char="F0A8"/>
+            </w:r>
+            <w:r>
+              <w:rPr>
+                <w:lang w:val="en-US"/>
+              </w:rPr>
+              <w:t xml:space="preserve"> </w:t>
+            </w:r>
+            <w:r>
+              <w:rPr>
+                <w:lang w:val="en-US"/>
+              </w:rPr>
+              <w:t>Other</w:t>
+            </w:r>
+            <w:r>
+              <w:rPr>
+                <w:lang w:val="en-US"/>
+              </w:rPr>
+              <w:t xml:space="preserve">    </w:t>
+            </w:r>
+            <w:r>
+              <w:rPr>
+                <w:b/>
+                <w:bCs/>
+                <w:sz w:val="24"/>
+                <w:szCs w:val="28"/>
+                <w:lang w:val="en-US"/>
+              </w:rPr>
+              <w:sym w:font="Wingdings" w:char="F0A8"/>
+            </w:r>
+            <w:r>
+              <w:rPr>
+                <w:lang w:val="en-US"/>
+              </w:rPr>
+              <w:t xml:space="preserve"> Prefer not to say </w:t>
             </w:r>
           </w:p>
         </w:tc>

</xml_diff>

<commit_message>
Clarified that the coordination team will also verify anonymization
</commit_message>
<xml_diff>
--- a/Work Group Guide/Source/Informed Consent Form.docx
+++ b/Work Group Guide/Source/Informed Consent Form.docx
@@ -776,13 +776,19 @@
               <w:rPr>
                 <w:lang w:val="en-US"/>
               </w:rPr>
-              <w:t>All collected data is anonymized and scrubbed of business-sensitive information by the facilitator and then</w:t>
-            </w:r>
-            <w:r>
-              <w:rPr>
-                <w:lang w:val="en-US"/>
-              </w:rPr>
-              <w:t xml:space="preserve"> shared with the research initiative for analysis.</w:t>
+              <w:t>All collected data is anonymized and scrubbed of sensitive information by the facilitator and then</w:t>
+            </w:r>
+            <w:r>
+              <w:rPr>
+                <w:lang w:val="en-US"/>
+              </w:rPr>
+              <w:t xml:space="preserve"> shared with the research initiative</w:t>
+            </w:r>
+            <w:r>
+              <w:rPr>
+                <w:lang w:val="en-US"/>
+              </w:rPr>
+              <w:t>. The initiative’s coordination team will verify anonymization before any analysis.</w:t>
             </w:r>
           </w:p>
           <w:p>

</xml_diff>